<commit_message>
refactor: Revise database schema to v2, consolidating memories and signals into a unified structure
- Removed deprecated conformance and repository plans.
- Updated algorithms documentation and scripts to reflect changes in memory and signal handling.
- Adjusted various operations to align with the new schema, ensuring compatibility and improved performance.
- Enhanced tests to validate the new memory structure and its interactions.
</commit_message>
<xml_diff>
--- a/algorithms.docx
+++ b/algorithms.docx
@@ -135,6 +135,47 @@
     </w:p>
     <w:p>
       <w:r>
+        <w:t xml:space="preserve">Weight normalization and blending for combining multiple signals:</w:t>
+      </w:r>
+    </w:p>
+    <w:p>
+      <w:pPr>
+        <w:pStyle w:val="Equation"/>
+      </w:pPr>
+      <w:r>
+        <w:rPr>
+          <w:rFonts w:ascii="Courier New" w:cs="Courier New" w:eastAsia="Courier New" w:hAnsi="Courier New"/>
+          <w:sz w:val="20"/>
+          <w:szCs w:val="20"/>
+        </w:rPr>
+        <w:t xml:space="preserve">normalize(w) = w / max(sum(w), ε) # w is a weight vector</w:t>
+      </w:r>
+    </w:p>
+    <w:p>
+      <w:r>
+        <w:t xml:space="preserve">Edge case: if sum(w) &lt; ε, return uniform weights (1/|w|) to avoid division by zero or invalid probability distributions.</w:t>
+      </w:r>
+    </w:p>
+    <w:p>
+      <w:pPr>
+        <w:pStyle w:val="Equation"/>
+      </w:pPr>
+      <w:r>
+        <w:rPr>
+          <w:rFonts w:ascii="Courier New" w:cs="Courier New" w:eastAsia="Courier New" w:hAnsi="Courier New"/>
+          <w:sz w:val="20"/>
+          <w:szCs w:val="20"/>
+        </w:rPr>
+        <w:t xml:space="preserve">blend(values, weights) = Σᵢ values[i] × weights[i]</w:t>
+      </w:r>
+    </w:p>
+    <w:p>
+      <w:r>
+        <w:t xml:space="preserve">Note: normalize() operates on weight vectors, not scalars. When used with scalar expressions like lerp(), collect the scalars into a vector first: normalize([lerp(...), lerp(...), ...]). The blend() function assumes pre-normalized weights summing to 1.</w:t>
+      </w:r>
+    </w:p>
+    <w:p>
+      <w:r>
         <w:t xml:space="preserve">For vectors, we define cosine similarity as cos(u, v) = u·v / (‖u‖ × ‖v‖), and safe L2 normalization as l2_normalize(v) = v / max(‖v‖, ε). Shannon entropy is computed in nats: H(p) = −Σᵢ pᵢ ln(pᵢ).</w:t>
       </w:r>
     </w:p>
@@ -192,10 +233,23 @@
           <w:b/>
           <w:bCs/>
         </w:rPr>
-        <w:t xml:space="preserve">Decay and rate calculations: </w:t>
-      </w:r>
-      <w:r>
-        <w:t xml:space="preserve">Internal decay formulas and rate calculations operate in seconds. Timestamps must be converted: t_seconds = t_milliseconds / 1000.</w:t>
+        <w:t xml:space="preserve">Internal time representation: </w:t>
+      </w:r>
+      <w:r>
+        <w:t xml:space="preserve">All internal time calculations operate in seconds. The now() function returns the current time in seconds:</w:t>
+      </w:r>
+    </w:p>
+    <w:p>
+      <w:pPr>
+        <w:pStyle w:val="Equation"/>
+      </w:pPr>
+      <w:r>
+        <w:rPr>
+          <w:rFonts w:ascii="Courier New" w:cs="Courier New" w:eastAsia="Courier New" w:hAnsi="Courier New"/>
+          <w:sz w:val="20"/>
+          <w:szCs w:val="20"/>
+        </w:rPr>
+        <w:t xml:space="preserve">now() = system_time_ms / 1000  # returns seconds</w:t>
       </w:r>
     </w:p>
     <w:p>
@@ -204,23 +258,10 @@
           <w:b/>
           <w:bCs/>
         </w:rPr>
-        <w:t xml:space="preserve">Time constants: </w:t>
-      </w:r>
-      <w:r>
-        <w:t xml:space="preserve">All time-related constants are specified with explicit units (e.g., τ_min = 120 seconds, kRecencyTau = 60 seconds).</w:t>
-      </w:r>
-    </w:p>
-    <w:p>
-      <w:pPr>
-        <w:pStyle w:val="Heading2"/>
-      </w:pPr>
-      <w:r>
-        <w:t xml:space="preserve">1.2 The Three-Knob Philosophy</w:t>
-      </w:r>
-    </w:p>
-    <w:p>
-      <w:r>
-        <w:t xml:space="preserve">Cortext is governed by three continuous control parameters, each representing a distinct dimension of cognitive regulation:</w:t>
+        <w:t xml:space="preserve">Stored timestamps: </w:t>
+      </w:r>
+      <w:r>
+        <w:t xml:space="preserve">Internal timestamps (t_start, last_signal_ts, last_timestamp, last_write_ts, last_retrieval_ts) are stored in milliseconds (ms), matching the database schema convention. Internal calculations convert to seconds for rate logic.</w:t>
       </w:r>
     </w:p>
     <w:p>
@@ -229,10 +270,49 @@
           <w:b/>
           <w:bCs/>
         </w:rPr>
-        <w:t xml:space="preserve">Focus (F ∈ [0, 1]): </w:t>
-      </w:r>
-      <w:r>
-        <w:t xml:space="preserve">Perceptual selectivity and precision. Higher Focus narrows attention, increases relevance weighting, and reduces retrieval breadth. Focus modulates the trade-off between exploitation of known-relevant information and exploration of potentially useful context.</w:t>
+        <w:t xml:space="preserve">Time deltas: </w:t>
+      </w:r>
+      <w:r>
+        <w:t xml:space="preserve">All Δt values, elapsed times (mem_elapsed, signal_gap, idle_for), and time comparisons operate in seconds:</w:t>
+      </w:r>
+    </w:p>
+    <w:p>
+      <w:pPr>
+        <w:pStyle w:val="Equation"/>
+      </w:pPr>
+      <w:r>
+        <w:rPr>
+          <w:rFonts w:ascii="Courier New" w:cs="Courier New" w:eastAsia="Courier New" w:hAnsi="Courier New"/>
+          <w:sz w:val="20"/>
+          <w:szCs w:val="20"/>
+        </w:rPr>
+        <w:t xml:space="preserve">Δt ← now() − last_timestamp  # seconds</w:t>
+      </w:r>
+    </w:p>
+    <w:p>
+      <w:pPr>
+        <w:pStyle w:val="Equation"/>
+      </w:pPr>
+      <w:r>
+        <w:rPr>
+          <w:rFonts w:ascii="Courier New" w:cs="Courier New" w:eastAsia="Courier New" w:hAnsi="Courier New"/>
+          <w:sz w:val="20"/>
+          <w:szCs w:val="20"/>
+        </w:rPr>
+        <w:t xml:space="preserve">mem_elapsed ← now() − t_start  # seconds</w:t>
+      </w:r>
+    </w:p>
+    <w:p>
+      <w:pPr>
+        <w:pStyle w:val="Equation"/>
+      </w:pPr>
+      <w:r>
+        <w:rPr>
+          <w:rFonts w:ascii="Courier New" w:cs="Courier New" w:eastAsia="Courier New" w:hAnsi="Courier New"/>
+          <w:sz w:val="20"/>
+          <w:szCs w:val="20"/>
+        </w:rPr>
+        <w:t xml:space="preserve">signal_gap ← now() − last_signal_ts  # seconds</w:t>
       </w:r>
     </w:p>
     <w:p>
@@ -241,10 +321,23 @@
           <w:b/>
           <w:bCs/>
         </w:rPr>
-        <w:t xml:space="preserve">Sensitivity (S ∈ [0, 1]): </w:t>
-      </w:r>
-      <w:r>
-        <w:t xml:space="preserve">Plasticity and affective gain. Higher Sensitivity accelerates learning, increases emotional and novelty responsiveness, and raises write-rate targets. Sensitivity governs how readily the system captures novel information and responds to salient stimuli.</w:t>
+        <w:t xml:space="preserve">Time constants: </w:t>
+      </w:r>
+      <w:r>
+        <w:t xml:space="preserve">All time-related constants are specified with explicit units (e.g., τ_min = 120 seconds, kRecencyTau = 60 seconds). Threshold limits like max_mem_time(T) and gap_threshold(T) return values in seconds.</w:t>
+      </w:r>
+    </w:p>
+    <w:p>
+      <w:pPr>
+        <w:pStyle w:val="Heading2"/>
+      </w:pPr>
+      <w:r>
+        <w:t xml:space="preserve">1.2 The Three-Knob Philosophy</w:t>
+      </w:r>
+    </w:p>
+    <w:p>
+      <w:r>
+        <w:t xml:space="preserve">Cortext is governed by three continuous control parameters, each representing a distinct dimension of cognitive regulation:</w:t>
       </w:r>
     </w:p>
     <w:p>
@@ -253,6 +346,30 @@
           <w:b/>
           <w:bCs/>
         </w:rPr>
+        <w:t xml:space="preserve">Focus (F ∈ [0, 1]): </w:t>
+      </w:r>
+      <w:r>
+        <w:t xml:space="preserve">Perceptual selectivity and precision. Higher Focus narrows attention, increases relevance weighting, and reduces retrieval breadth. Focus modulates the trade-off between exploitation of known-relevant information and exploration of potentially useful context.</w:t>
+      </w:r>
+    </w:p>
+    <w:p>
+      <w:r>
+        <w:rPr>
+          <w:b/>
+          <w:bCs/>
+        </w:rPr>
+        <w:t xml:space="preserve">Sensitivity (S ∈ [0, 1]): </w:t>
+      </w:r>
+      <w:r>
+        <w:t xml:space="preserve">Plasticity and affective gain. Higher Sensitivity accelerates learning, increases emotional and novelty responsiveness, and raises write-rate targets. Sensitivity governs how readily the system captures novel information and responds to salient stimuli.</w:t>
+      </w:r>
+    </w:p>
+    <w:p>
+      <w:r>
+        <w:rPr>
+          <w:b/>
+          <w:bCs/>
+        </w:rPr>
         <w:t xml:space="preserve">Stability (T ∈ [0, 1]): </w:t>
       </w:r>
       <w:r>
@@ -593,7 +710,7 @@
           <w:sz w:val="20"/>
           <w:szCs w:val="20"/>
         </w:rPr>
-        <w:t xml:space="preserve">coherence_complement = 1 − coherence_t</w:t>
+        <w:t xml:space="preserve">coherence_complement = 1 − coherence_struct_t  # uses structural coherence</w:t>
       </w:r>
     </w:p>
     <w:p>
@@ -800,7 +917,7 @@
           <w:sz w:val="20"/>
           <w:szCs w:val="20"/>
         </w:rPr>
-        <w:t xml:space="preserve">mismatch_weight_prior = 1 − F</w:t>
+        <w:t xml:space="preserve">w_mismatch_prior = 1 − F</w:t>
       </w:r>
     </w:p>
     <w:p>
@@ -844,7 +961,7 @@
           <w:sz w:val="20"/>
           <w:szCs w:val="20"/>
         </w:rPr>
-        <w:t xml:space="preserve">recent_context ← tail(context_buffer, n_ctx(T))</w:t>
+        <w:t xml:space="preserve">recent_context ← tail(signals, n_ctx(T))</w:t>
       </w:r>
     </w:p>
     <w:p>
@@ -1355,7 +1472,7 @@
     </w:p>
     <w:p>
       <w:r>
-        <w:t xml:space="preserve">Distinct from instantaneous emotion, the mood state M_t maintains a persistent background affective tone:</w:t>
+        <w:t xml:space="preserve">Distinct from instantaneous emotion, the mood state M_t ∈ ℝ⁶ maintains a persistent background affective tone as a 6-dimensional vector (one component per emotion category from Section 2.2.2):</w:t>
       </w:r>
     </w:p>
     <w:p>
@@ -1394,6 +1511,19 @@
           <w:sz w:val="20"/>
           <w:szCs w:val="20"/>
         </w:rPr>
+        <w:t xml:space="preserve">e_t ← p_c for each c ∈ C  # 6D emotion probability vector</w:t>
+      </w:r>
+    </w:p>
+    <w:p>
+      <w:pPr>
+        <w:pStyle w:val="Equation"/>
+      </w:pPr>
+      <w:r>
+        <w:rPr>
+          <w:rFonts w:ascii="Courier New" w:cs="Courier New" w:eastAsia="Courier New" w:hAnsi="Courier New"/>
+          <w:sz w:val="20"/>
+          <w:szCs w:val="20"/>
+        </w:rPr>
         <w:t xml:space="preserve">M_t = λ_mood(T) × M_{t−1} + α_mood(S) × e_t</w:t>
       </w:r>
     </w:p>
@@ -1407,12 +1537,12 @@
           <w:sz w:val="20"/>
           <w:szCs w:val="20"/>
         </w:rPr>
-        <w:t xml:space="preserve">M_t ← clamp(M_t, −1.0, 1.0)</w:t>
-      </w:r>
-    </w:p>
-    <w:p>
-      <w:r>
-        <w:t xml:space="preserve">Note that this update does not enforce coefficient normalization; the explicit clamp handles potential accumulation. The mood state provides a separate threshold bias:</w:t>
+        <w:t xml:space="preserve">M_t ← clamp_elementwise(M_t, −1.0, 1.0)  # per-component</w:t>
+      </w:r>
+    </w:p>
+    <w:p>
+      <w:r>
+        <w:t xml:space="preserve">Note that this update does not enforce coefficient normalization; the explicit elementwise clamp handles potential accumulation. The mood state provides a separate threshold bias via its normalized magnitude:</w:t>
       </w:r>
     </w:p>
     <w:p>
@@ -1438,7 +1568,7 @@
           <w:sz w:val="20"/>
           <w:szCs w:val="20"/>
         </w:rPr>
-        <w:t xml:space="preserve">m_norm ← ‖M_t‖ / √6</w:t>
+        <w:t xml:space="preserve">m_norm ← ‖M_t‖ / √6  # max norm when all components at 1</w:t>
       </w:r>
     </w:p>
     <w:p>
@@ -1568,6 +1698,50 @@
     </w:p>
     <w:p>
       <w:r>
+        <w:t xml:space="preserve">The stability update uses uncertainty-modulated learning rate and a stability-derived retention window:</w:t>
+      </w:r>
+    </w:p>
+    <w:p>
+      <w:pPr>
+        <w:pStyle w:val="Equation"/>
+      </w:pPr>
+      <w:r>
+        <w:rPr>
+          <w:rFonts w:ascii="Courier New" w:cs="Courier New" w:eastAsia="Courier New" w:hAnsi="Courier New"/>
+          <w:sz w:val="20"/>
+          <w:szCs w:val="20"/>
+        </w:rPr>
+        <w:t xml:space="preserve">α_min_T = 0.02; α_span_T = 0.18</w:t>
+      </w:r>
+    </w:p>
+    <w:p>
+      <w:pPr>
+        <w:pStyle w:val="Equation"/>
+      </w:pPr>
+      <w:r>
+        <w:rPr>
+          <w:rFonts w:ascii="Courier New" w:cs="Courier New" w:eastAsia="Courier New" w:hAnsi="Courier New"/>
+          <w:sz w:val="20"/>
+          <w:szCs w:val="20"/>
+        </w:rPr>
+        <w:t xml:space="preserve">α_T(t) = α_min_T + (1 − T) × α_span_T × u(t)</w:t>
+      </w:r>
+    </w:p>
+    <w:p>
+      <w:pPr>
+        <w:pStyle w:val="Equation"/>
+      </w:pPr>
+      <w:r>
+        <w:rPr>
+          <w:rFonts w:ascii="Courier New" w:cs="Courier New" w:eastAsia="Courier New" w:hAnsi="Courier New"/>
+          <w:sz w:val="20"/>
+          <w:szCs w:val="20"/>
+        </w:rPr>
+        <w:t xml:space="preserve">w_ret(T) = round(lerp(10, 50, T))  # retention history window size</w:t>
+      </w:r>
+    </w:p>
+    <w:p>
+      <w:r>
         <w:t xml:space="preserve">At each signal event, compute retention statistics and adjust half-life:</w:t>
       </w:r>
     </w:p>
@@ -1789,43 +1963,43 @@
         <w:pStyle w:val="Heading3"/>
       </w:pPr>
       <w:r>
-        <w:t xml:space="preserve">3.1.1 Coherence</w:t>
-      </w:r>
-    </w:p>
-    <w:p>
-      <w:r>
-        <w:t xml:space="preserve">Coherence measures integration of the current signal with context:</w:t>
-      </w:r>
-    </w:p>
-    <w:p>
-      <w:pPr>
-        <w:pStyle w:val="Equation"/>
-      </w:pPr>
-      <w:r>
-        <w:rPr>
-          <w:rFonts w:ascii="Courier New" w:cs="Courier New" w:eastAsia="Courier New" w:hAnsi="Courier New"/>
-          <w:sz w:val="20"/>
-          <w:szCs w:val="20"/>
-        </w:rPr>
-        <w:t xml:space="preserve">raw ← var([cos(x_t, c) for c in context_window])</w:t>
-      </w:r>
-    </w:p>
-    <w:p>
-      <w:pPr>
-        <w:pStyle w:val="Equation"/>
-      </w:pPr>
-      <w:r>
-        <w:rPr>
-          <w:rFonts w:ascii="Courier New" w:cs="Courier New" w:eastAsia="Courier New" w:hAnsi="Courier New"/>
-          <w:sz w:val="20"/>
-          <w:szCs w:val="20"/>
-        </w:rPr>
-        <w:t xml:space="preserve">coherence_t ← 1 − clamp(raw, 0, 1)</w:t>
-      </w:r>
-    </w:p>
-    <w:p>
-      <w:r>
-        <w:t xml:space="preserve">High coherence (low variance in similarities) indicates the signal fits consistently with context. The effective Focus is modulated: F_eff = F × (0.5 + 0.5 × coherence_t).</w:t>
+        <w:t xml:space="preserve">3.1.1 Structural Coherence</w:t>
+      </w:r>
+    </w:p>
+    <w:p>
+      <w:r>
+        <w:t xml:space="preserve">Structural coherence (coherence_struct) measures integration of the current signal with the broader context window. This metric is distinct from memory coherence (coherence_mem, defined in Section 4.4.2) which tracks within-memory similarity:</w:t>
+      </w:r>
+    </w:p>
+    <w:p>
+      <w:pPr>
+        <w:pStyle w:val="Equation"/>
+      </w:pPr>
+      <w:r>
+        <w:rPr>
+          <w:rFonts w:ascii="Courier New" w:cs="Courier New" w:eastAsia="Courier New" w:hAnsi="Courier New"/>
+          <w:sz w:val="20"/>
+          <w:szCs w:val="20"/>
+        </w:rPr>
+        <w:t xml:space="preserve">raw ← var([cos(x_t, c) for c in recent_context])</w:t>
+      </w:r>
+    </w:p>
+    <w:p>
+      <w:pPr>
+        <w:pStyle w:val="Equation"/>
+      </w:pPr>
+      <w:r>
+        <w:rPr>
+          <w:rFonts w:ascii="Courier New" w:cs="Courier New" w:eastAsia="Courier New" w:hAnsi="Courier New"/>
+          <w:sz w:val="20"/>
+          <w:szCs w:val="20"/>
+        </w:rPr>
+        <w:t xml:space="preserve">coherence_struct_t ← 1 − clamp(raw, 0, 1)  # range [0, 1]</w:t>
+      </w:r>
+    </w:p>
+    <w:p>
+      <w:r>
+        <w:t xml:space="preserve">High structural coherence (low variance in similarities) indicates the signal fits consistently with context. The effective Focus is modulated: F_eff = F × (0.5 + 0.5 × coherence_struct_t).</w:t>
       </w:r>
     </w:p>
     <w:p>
@@ -2302,7 +2476,7 @@
           </w:tcPr>
           <w:p>
             <w:r>
-              <w:t xml:space="preserve">Prediction Error</w:t>
+              <w:t xml:space="preserve">Surprise</w:t>
             </w:r>
           </w:p>
         </w:tc>
@@ -3290,7 +3464,20 @@
     </w:p>
     <w:p>
       <w:r>
-        <w:t xml:space="preserve">Instantaneous rate estimation with bias correction:</w:t>
+        <w:t xml:space="preserve">Instantaneous rate estimation with bias correction. Δwrites is the binary indicator (0 or 1) of whether a write occurred during the current timestep:</w:t>
+      </w:r>
+    </w:p>
+    <w:p>
+      <w:pPr>
+        <w:pStyle w:val="Equation"/>
+      </w:pPr>
+      <w:r>
+        <w:rPr>
+          <w:rFonts w:ascii="Courier New" w:cs="Courier New" w:eastAsia="Courier New" w:hAnsi="Courier New"/>
+          <w:sz w:val="20"/>
+          <w:szCs w:val="20"/>
+        </w:rPr>
+        <w:t xml:space="preserve">Δwrites ← 1 if write_memory else 0  # binary write event</w:t>
       </w:r>
     </w:p>
     <w:p>
@@ -3513,6 +3700,159 @@
     </w:p>
     <w:p>
       <w:pPr>
+        <w:pStyle w:val="Heading3"/>
+      </w:pPr>
+      <w:r>
+        <w:t xml:space="preserve">4.2.4 Sensitivity-Based Threshold Adjustment</w:t>
+      </w:r>
+    </w:p>
+    <w:p>
+      <w:r>
+        <w:t xml:space="preserve">Sensitivity modulates threshold based on recent score volatility:</w:t>
+      </w:r>
+    </w:p>
+    <w:p>
+      <w:pPr>
+        <w:pStyle w:val="Equation"/>
+      </w:pPr>
+      <w:r>
+        <w:rPr>
+          <w:rFonts w:ascii="Courier New" w:cs="Courier New" w:eastAsia="Courier New" w:hAnsi="Courier New"/>
+          <w:sz w:val="20"/>
+          <w:szCs w:val="20"/>
+        </w:rPr>
+        <w:t xml:space="preserve">σ_scores ← std(scores[t−w:t])</w:t>
+      </w:r>
+    </w:p>
+    <w:p>
+      <w:pPr>
+        <w:pStyle w:val="Equation"/>
+      </w:pPr>
+      <w:r>
+        <w:rPr>
+          <w:rFonts w:ascii="Courier New" w:cs="Courier New" w:eastAsia="Courier New" w:hAnsi="Courier New"/>
+          <w:sz w:val="20"/>
+          <w:szCs w:val="20"/>
+        </w:rPr>
+        <w:t xml:space="preserve">κ_sens = 0.08  # sensitivity gain</w:t>
+      </w:r>
+    </w:p>
+    <w:p>
+      <w:pPr>
+        <w:pStyle w:val="Equation"/>
+      </w:pPr>
+      <w:r>
+        <w:rPr>
+          <w:rFonts w:ascii="Courier New" w:cs="Courier New" w:eastAsia="Courier New" w:hAnsi="Courier New"/>
+          <w:sz w:val="20"/>
+          <w:szCs w:val="20"/>
+        </w:rPr>
+        <w:t xml:space="preserve">cap_sens ← 0.20 × hysteresis_t</w:t>
+      </w:r>
+    </w:p>
+    <w:p>
+      <w:pPr>
+        <w:pStyle w:val="Equation"/>
+      </w:pPr>
+      <w:r>
+        <w:rPr>
+          <w:rFonts w:ascii="Courier New" w:cs="Courier New" w:eastAsia="Courier New" w:hAnsi="Courier New"/>
+          <w:sz w:val="20"/>
+          <w:szCs w:val="20"/>
+        </w:rPr>
+        <w:t xml:space="preserve">Δθ_sens ← clamp(−κ_sens × S × (σ_scores − 0.1),</w:t>
+      </w:r>
+    </w:p>
+    <w:p>
+      <w:pPr>
+        <w:pStyle w:val="Equation"/>
+      </w:pPr>
+      <w:r>
+        <w:rPr>
+          <w:rFonts w:ascii="Courier New" w:cs="Courier New" w:eastAsia="Courier New" w:hAnsi="Courier New"/>
+          <w:sz w:val="20"/>
+          <w:szCs w:val="20"/>
+        </w:rPr>
+        <w:t xml:space="preserve">                −cap_sens, +cap_sens)</w:t>
+      </w:r>
+    </w:p>
+    <w:p>
+      <w:r>
+        <w:t xml:space="preserve">High score variance with high Sensitivity lowers threshold, capturing more volatile signals.</w:t>
+      </w:r>
+    </w:p>
+    <w:p>
+      <w:pPr>
+        <w:pStyle w:val="Heading3"/>
+      </w:pPr>
+      <w:r>
+        <w:t xml:space="preserve">4.2.5 Precision-Based Threshold Adjustment</w:t>
+      </w:r>
+    </w:p>
+    <w:p>
+      <w:r>
+        <w:t xml:space="preserve">Focus-driven precision tightens threshold when structural coherence is high:</w:t>
+      </w:r>
+    </w:p>
+    <w:p>
+      <w:pPr>
+        <w:pStyle w:val="Equation"/>
+      </w:pPr>
+      <w:r>
+        <w:rPr>
+          <w:rFonts w:ascii="Courier New" w:cs="Courier New" w:eastAsia="Courier New" w:hAnsi="Courier New"/>
+          <w:sz w:val="20"/>
+          <w:szCs w:val="20"/>
+        </w:rPr>
+        <w:t xml:space="preserve">κ_prec = 0.06  # precision gain</w:t>
+      </w:r>
+    </w:p>
+    <w:p>
+      <w:pPr>
+        <w:pStyle w:val="Equation"/>
+      </w:pPr>
+      <w:r>
+        <w:rPr>
+          <w:rFonts w:ascii="Courier New" w:cs="Courier New" w:eastAsia="Courier New" w:hAnsi="Courier New"/>
+          <w:sz w:val="20"/>
+          <w:szCs w:val="20"/>
+        </w:rPr>
+        <w:t xml:space="preserve">cap_prec ← 0.15 × hysteresis_t</w:t>
+      </w:r>
+    </w:p>
+    <w:p>
+      <w:pPr>
+        <w:pStyle w:val="Equation"/>
+      </w:pPr>
+      <w:r>
+        <w:rPr>
+          <w:rFonts w:ascii="Courier New" w:cs="Courier New" w:eastAsia="Courier New" w:hAnsi="Courier New"/>
+          <w:sz w:val="20"/>
+          <w:szCs w:val="20"/>
+        </w:rPr>
+        <w:t xml:space="preserve">Δθ_prec ← clamp(κ_prec × F × (coherence_struct_t − 0.5),</w:t>
+      </w:r>
+    </w:p>
+    <w:p>
+      <w:pPr>
+        <w:pStyle w:val="Equation"/>
+      </w:pPr>
+      <w:r>
+        <w:rPr>
+          <w:rFonts w:ascii="Courier New" w:cs="Courier New" w:eastAsia="Courier New" w:hAnsi="Courier New"/>
+          <w:sz w:val="20"/>
+          <w:szCs w:val="20"/>
+        </w:rPr>
+        <w:t xml:space="preserve">                −cap_prec, +cap_prec)</w:t>
+      </w:r>
+    </w:p>
+    <w:p>
+      <w:r>
+        <w:t xml:space="preserve">High structural coherence with high Focus raises threshold, enforcing stricter relevance filtering.</w:t>
+      </w:r>
+    </w:p>
+    <w:p>
+      <w:pPr>
         <w:pStyle w:val="Heading2"/>
       </w:pPr>
       <w:r>
@@ -3521,7 +3861,7 @@
     </w:p>
     <w:p>
       <w:r>
-        <w:t xml:space="preserve">All threshold deltas combine and pass through safety limiting:</w:t>
+        <w:t xml:space="preserve">All threshold deltas combine and pass through safety limiting. The emotion and mood deltas from Section 2.2.3-2.2.4 are denoted Δθ_emo = ΔThreshold_emotion_t and Δθ_mood = ΔThreshold_mood_t:</w:t>
       </w:r>
     </w:p>
     <w:p>
@@ -3661,7 +4001,7 @@
     </w:p>
     <w:p>
       <w:r>
-        <w:t xml:space="preserve">This approach is validated by recent research on episodic memory in LLMs (EM-LLM, 2024), which demonstrates that combining surprise-based boundary detection with cohesion metrics produces memory accumulation strongly correlated with human perception. The algorithm operates purely on embedding space and timestamps, making it modality-agnostic—applicable to text tokens, audio chunks, video frames, or any signal stream.</w:t>
+        <w:t xml:space="preserve">This approach draws from EM-LLM (Fountas et al., 2024), which segments token sequences into episodic events using surprise-based boundary detection refined by graph-theoretic cohesion metrics. Their work shows that combining prediction error signals with within-segment coherence produces boundaries strongly correlated with human event perception. Our adaptation uses embedding drift as a proxy for surprise and cosine similarity for cohesion, enabling modality-agnostic operation across text tokens, audio chunks, video frames, or any signal stream.</w:t>
       </w:r>
     </w:p>
     <w:p>
@@ -3765,7 +4105,7 @@
           <w:sz w:val="20"/>
           <w:szCs w:val="20"/>
         </w:rPr>
-        <w:t xml:space="preserve">t_acc_start ← timestamp of accumulation start</w:t>
+        <w:t xml:space="preserve">t_start ← timestamp of accumulation start</w:t>
       </w:r>
     </w:p>
     <w:p>
@@ -3783,33 +4123,46 @@
     </w:p>
     <w:p>
       <w:r>
-        <w:t xml:space="preserve">On each signal, update running statistics:</w:t>
-      </w:r>
-    </w:p>
-    <w:p>
-      <w:pPr>
-        <w:pStyle w:val="Equation"/>
-      </w:pPr>
-      <w:r>
-        <w:rPr>
-          <w:rFonts w:ascii="Courier New" w:cs="Courier New" w:eastAsia="Courier New" w:hAnsi="Courier New"/>
-          <w:sz w:val="20"/>
-          <w:szCs w:val="20"/>
-        </w:rPr>
-        <w:t xml:space="preserve">μ_acc ← ((n − 1) × μ_acc + x_t) / n</w:t>
-      </w:r>
-    </w:p>
-    <w:p>
-      <w:pPr>
-        <w:pStyle w:val="Equation"/>
-      </w:pPr>
-      <w:r>
-        <w:rPr>
-          <w:rFonts w:ascii="Courier New" w:cs="Courier New" w:eastAsia="Courier New" w:hAnsi="Courier New"/>
-          <w:sz w:val="20"/>
-          <w:szCs w:val="20"/>
-        </w:rPr>
-        <w:t xml:space="preserve">D_acc ← D_acc + drift_mag_t</w:t>
+        <w:t xml:space="preserve">On each signal, update running statistics (note: n is the count before this signal):</w:t>
+      </w:r>
+    </w:p>
+    <w:p>
+      <w:pPr>
+        <w:pStyle w:val="Equation"/>
+      </w:pPr>
+      <w:r>
+        <w:rPr>
+          <w:rFonts w:ascii="Courier New" w:cs="Courier New" w:eastAsia="Courier New" w:hAnsi="Courier New"/>
+          <w:sz w:val="20"/>
+          <w:szCs w:val="20"/>
+        </w:rPr>
+        <w:t xml:space="preserve">μ_acc ← (n × μ_acc + x_t) / (n + 1)</w:t>
+      </w:r>
+    </w:p>
+    <w:p>
+      <w:pPr>
+        <w:pStyle w:val="Equation"/>
+      </w:pPr>
+      <w:r>
+        <w:rPr>
+          <w:rFonts w:ascii="Courier New" w:cs="Courier New" w:eastAsia="Courier New" w:hAnsi="Courier New"/>
+          <w:sz w:val="20"/>
+          <w:szCs w:val="20"/>
+        </w:rPr>
+        <w:t xml:space="preserve">n ← n + 1</w:t>
+      </w:r>
+    </w:p>
+    <w:p>
+      <w:pPr>
+        <w:pStyle w:val="Equation"/>
+      </w:pPr>
+      <w:r>
+        <w:rPr>
+          <w:rFonts w:ascii="Courier New" w:cs="Courier New" w:eastAsia="Courier New" w:hAnsi="Courier New"/>
+          <w:sz w:val="20"/>
+          <w:szCs w:val="20"/>
+        </w:rPr>
+        <w:t xml:space="preserve">drift_acc ← drift_acc + drift_mag_t</w:t>
       </w:r>
     </w:p>
     <w:p>
@@ -3861,7 +4214,7 @@
           <w:sz w:val="20"/>
           <w:szCs w:val="20"/>
         </w:rPr>
-        <w:t xml:space="preserve">n ← n + 1</w:t>
+        <w:t xml:space="preserve">last_signal_ts ← now()  # update timestamp for next gap calculation</w:t>
       </w:r>
     </w:p>
     <w:p>
@@ -3913,30 +4266,30 @@
           <w:sz w:val="20"/>
           <w:szCs w:val="20"/>
         </w:rPr>
-        <w:t xml:space="preserve">η_seg ← EWMA(η_seg, d_step, α = lerp(0.3, 0.1, T))</w:t>
-      </w:r>
-    </w:p>
-    <w:p>
-      <w:r>
-        <w:t xml:space="preserve">Coherence within the segment window:</w:t>
-      </w:r>
-    </w:p>
-    <w:p>
-      <w:pPr>
-        <w:pStyle w:val="Equation"/>
-      </w:pPr>
-      <w:r>
-        <w:rPr>
-          <w:rFonts w:ascii="Courier New" w:cs="Courier New" w:eastAsia="Courier New" w:hAnsi="Courier New"/>
-          <w:sz w:val="20"/>
-          <w:szCs w:val="20"/>
-        </w:rPr>
-        <w:t xml:space="preserve">coherence_t ← mean([cos(x_t, x_i) for x_i in segment_window])</w:t>
-      </w:r>
-    </w:p>
-    <w:p>
-      <w:r>
-        <w:t xml:space="preserve">Note: This dual-signal approach mirrors EM-LLM's boundary detection, which uses surprise level refined by graph-theoretic cohesion metrics. The drift spike captures prediction error (cross-unit separation), while coherence tracks within-unit similarity.</w:t>
+        <w:t xml:space="preserve">eta_acc ← EWMA(eta_acc, d_step, α = lerp(0.3, 0.1, T))</w:t>
+      </w:r>
+    </w:p>
+    <w:p>
+      <w:r>
+        <w:t xml:space="preserve">Memory coherence tracks similarity within the current memory accumulation window (range [−1, 1] from mean cosine):</w:t>
+      </w:r>
+    </w:p>
+    <w:p>
+      <w:pPr>
+        <w:pStyle w:val="Equation"/>
+      </w:pPr>
+      <w:r>
+        <w:rPr>
+          <w:rFonts w:ascii="Courier New" w:cs="Courier New" w:eastAsia="Courier New" w:hAnsi="Courier New"/>
+          <w:sz w:val="20"/>
+          <w:szCs w:val="20"/>
+        </w:rPr>
+        <w:t xml:space="preserve">coherence_prev ← mean([cos(x_t, x_i) for x_i in current_window])</w:t>
+      </w:r>
+    </w:p>
+    <w:p>
+      <w:r>
+        <w:t xml:space="preserve">Note: coherence_mem is distinct from coherence_struct (Section 3.1.1). The former tracks within-memory similarity using raw mean cosine, while the latter measures variance-based integration with broader context. This dual-signal approach mirrors EM-LLM's boundary detection mechanism. In their formulation, boundaries occur where surprise (token-level prediction error) exceeds a threshold and segment cohesion drops. Our drift spike approximates surprise via embedding-space velocity, while coherence_mem drop captures within-memory similarity degradation.</w:t>
       </w:r>
     </w:p>
     <w:p>
@@ -3988,20 +4341,20 @@
           <w:sz w:val="20"/>
           <w:szCs w:val="20"/>
         </w:rPr>
-        <w:t xml:space="preserve">drift_spike ← (d_step − η_seg) / max(η_seg, ε)</w:t>
-      </w:r>
-    </w:p>
-    <w:p>
-      <w:pPr>
-        <w:pStyle w:val="Equation"/>
-      </w:pPr>
-      <w:r>
-        <w:rPr>
-          <w:rFonts w:ascii="Courier New" w:cs="Courier New" w:eastAsia="Courier New" w:hAnsi="Courier New"/>
-          <w:sz w:val="20"/>
-          <w:szCs w:val="20"/>
-        </w:rPr>
-        <w:t xml:space="preserve">coh_drop ← max(0, coherence_{t−1} − coherence_t)</w:t>
+        <w:t xml:space="preserve">drift_spike ← (d_step − eta_acc) / max(eta_acc, ε)</w:t>
+      </w:r>
+    </w:p>
+    <w:p>
+      <w:pPr>
+        <w:pStyle w:val="Equation"/>
+      </w:pPr>
+      <w:r>
+        <w:rPr>
+          <w:rFonts w:ascii="Courier New" w:cs="Courier New" w:eastAsia="Courier New" w:hAnsi="Courier New"/>
+          <w:sz w:val="20"/>
+          <w:szCs w:val="20"/>
+        </w:rPr>
+        <w:t xml:space="preserve">coh_drop ← max(0, coherence_prev − coherence_curr)</w:t>
       </w:r>
     </w:p>
     <w:p>
@@ -4058,90 +4411,90 @@
           <w:sz w:val="20"/>
           <w:szCs w:val="20"/>
         </w:rPr>
-        <w:t xml:space="preserve">max_seg_time(T) = lerp(30, 120, T)  # seconds</w:t>
-      </w:r>
-    </w:p>
-    <w:p>
-      <w:pPr>
-        <w:pStyle w:val="Equation"/>
-      </w:pPr>
-      <w:r>
-        <w:rPr>
-          <w:rFonts w:ascii="Courier New" w:cs="Courier New" w:eastAsia="Courier New" w:hAnsi="Courier New"/>
-          <w:sz w:val="20"/>
-          <w:szCs w:val="20"/>
-        </w:rPr>
-        <w:t xml:space="preserve">max_seg_drift(S) = lerp(0.8, 2.0, S)  # cumulative drift cap</w:t>
-      </w:r>
-    </w:p>
-    <w:p>
-      <w:r>
-        <w:t xml:space="preserve">Trigger segment flush when:</w:t>
-      </w:r>
-    </w:p>
-    <w:p>
-      <w:pPr>
-        <w:pStyle w:val="Equation"/>
-      </w:pPr>
-      <w:r>
-        <w:rPr>
-          <w:rFonts w:ascii="Courier New" w:cs="Courier New" w:eastAsia="Courier New" w:hAnsi="Courier New"/>
-          <w:sz w:val="20"/>
-          <w:szCs w:val="20"/>
-        </w:rPr>
-        <w:t xml:space="preserve">segment_elapsed ← now() − t_seg_start</w:t>
-      </w:r>
-    </w:p>
-    <w:p>
-      <w:pPr>
-        <w:pStyle w:val="Equation"/>
-      </w:pPr>
-      <w:r>
-        <w:rPr>
-          <w:rFonts w:ascii="Courier New" w:cs="Courier New" w:eastAsia="Courier New" w:hAnsi="Courier New"/>
-          <w:sz w:val="20"/>
-          <w:szCs w:val="20"/>
-        </w:rPr>
-        <w:t xml:space="preserve">flush_segment = (boundary_score &gt; b_thresh(F, S)) OR</w:t>
-      </w:r>
-    </w:p>
-    <w:p>
-      <w:pPr>
-        <w:pStyle w:val="Equation"/>
-      </w:pPr>
-      <w:r>
-        <w:rPr>
-          <w:rFonts w:ascii="Courier New" w:cs="Courier New" w:eastAsia="Courier New" w:hAnsi="Courier New"/>
-          <w:sz w:val="20"/>
-          <w:szCs w:val="20"/>
-        </w:rPr>
-        <w:t xml:space="preserve">                 (segment_elapsed &gt; max_seg_time(T)) OR</w:t>
-      </w:r>
-    </w:p>
-    <w:p>
-      <w:pPr>
-        <w:pStyle w:val="Equation"/>
-      </w:pPr>
-      <w:r>
-        <w:rPr>
-          <w:rFonts w:ascii="Courier New" w:cs="Courier New" w:eastAsia="Courier New" w:hAnsi="Courier New"/>
-          <w:sz w:val="20"/>
-          <w:szCs w:val="20"/>
-        </w:rPr>
-        <w:t xml:space="preserve">                 (D_seg &gt; max_seg_drift(S)) OR</w:t>
-      </w:r>
-    </w:p>
-    <w:p>
-      <w:pPr>
-        <w:pStyle w:val="Equation"/>
-      </w:pPr>
-      <w:r>
-        <w:rPr>
-          <w:rFonts w:ascii="Courier New" w:cs="Courier New" w:eastAsia="Courier New" w:hAnsi="Courier New"/>
-          <w:sz w:val="20"/>
-          <w:szCs w:val="20"/>
-        </w:rPr>
-        <w:t xml:space="preserve">                 (signal_gap &gt; gap_threshold(T))</w:t>
+        <w:t xml:space="preserve">max_mem_time(T) = lerp(30, 120, T)  # seconds</w:t>
+      </w:r>
+    </w:p>
+    <w:p>
+      <w:pPr>
+        <w:pStyle w:val="Equation"/>
+      </w:pPr>
+      <w:r>
+        <w:rPr>
+          <w:rFonts w:ascii="Courier New" w:cs="Courier New" w:eastAsia="Courier New" w:hAnsi="Courier New"/>
+          <w:sz w:val="20"/>
+          <w:szCs w:val="20"/>
+        </w:rPr>
+        <w:t xml:space="preserve">max_mem_drift(S) = lerp(0.8, 2.0, S)  # cumulative drift cap</w:t>
+      </w:r>
+    </w:p>
+    <w:p>
+      <w:r>
+        <w:t xml:space="preserve">Trigger memory flush when:</w:t>
+      </w:r>
+    </w:p>
+    <w:p>
+      <w:pPr>
+        <w:pStyle w:val="Equation"/>
+      </w:pPr>
+      <w:r>
+        <w:rPr>
+          <w:rFonts w:ascii="Courier New" w:cs="Courier New" w:eastAsia="Courier New" w:hAnsi="Courier New"/>
+          <w:sz w:val="20"/>
+          <w:szCs w:val="20"/>
+        </w:rPr>
+        <w:t xml:space="preserve">mem_elapsed ← now() − t_start</w:t>
+      </w:r>
+    </w:p>
+    <w:p>
+      <w:pPr>
+        <w:pStyle w:val="Equation"/>
+      </w:pPr>
+      <w:r>
+        <w:rPr>
+          <w:rFonts w:ascii="Courier New" w:cs="Courier New" w:eastAsia="Courier New" w:hAnsi="Courier New"/>
+          <w:sz w:val="20"/>
+          <w:szCs w:val="20"/>
+        </w:rPr>
+        <w:t xml:space="preserve">should_flush = (boundary_score &gt; b_thresh(F, S)) OR</w:t>
+      </w:r>
+    </w:p>
+    <w:p>
+      <w:pPr>
+        <w:pStyle w:val="Equation"/>
+      </w:pPr>
+      <w:r>
+        <w:rPr>
+          <w:rFonts w:ascii="Courier New" w:cs="Courier New" w:eastAsia="Courier New" w:hAnsi="Courier New"/>
+          <w:sz w:val="20"/>
+          <w:szCs w:val="20"/>
+        </w:rPr>
+        <w:t xml:space="preserve">               (mem_elapsed &gt; max_mem_time(T)) OR</w:t>
+      </w:r>
+    </w:p>
+    <w:p>
+      <w:pPr>
+        <w:pStyle w:val="Equation"/>
+      </w:pPr>
+      <w:r>
+        <w:rPr>
+          <w:rFonts w:ascii="Courier New" w:cs="Courier New" w:eastAsia="Courier New" w:hAnsi="Courier New"/>
+          <w:sz w:val="20"/>
+          <w:szCs w:val="20"/>
+        </w:rPr>
+        <w:t xml:space="preserve">               (drift_acc &gt; max_mem_drift(S)) OR</w:t>
+      </w:r>
+    </w:p>
+    <w:p>
+      <w:pPr>
+        <w:pStyle w:val="Equation"/>
+      </w:pPr>
+      <w:r>
+        <w:rPr>
+          <w:rFonts w:ascii="Courier New" w:cs="Courier New" w:eastAsia="Courier New" w:hAnsi="Courier New"/>
+          <w:sz w:val="20"/>
+          <w:szCs w:val="20"/>
+        </w:rPr>
+        <w:t xml:space="preserve">               (signal_gap &gt; gap_threshold(T))</w:t>
       </w:r>
     </w:p>
     <w:p>
@@ -4229,7 +4582,7 @@
           <w:sz w:val="20"/>
           <w:szCs w:val="20"/>
         </w:rPr>
-        <w:t xml:space="preserve">    flush_segment()  # includes spike signal</w:t>
+        <w:t xml:space="preserve">    commit_memory()  # includes spike signal</w:t>
       </w:r>
     </w:p>
     <w:p>
@@ -4260,7 +4613,7 @@
     </w:p>
     <w:p>
       <w:r>
-        <w:t xml:space="preserve">Segment-level score combines peak and average with coverage bonus:</w:t>
+        <w:t xml:space="preserve">Memory-level score combines peak and average with coverage bonus:</w:t>
       </w:r>
     </w:p>
     <w:p>
@@ -4299,20 +4652,20 @@
           <w:sz w:val="20"/>
           <w:szCs w:val="20"/>
         </w:rPr>
-        <w:t xml:space="preserve">coverage ← min(n / n_ctx(T), 1.0)  # segment completeness</w:t>
-      </w:r>
-    </w:p>
-    <w:p>
-      <w:pPr>
-        <w:pStyle w:val="Equation"/>
-      </w:pPr>
-      <w:r>
-        <w:rPr>
-          <w:rFonts w:ascii="Courier New" w:cs="Courier New" w:eastAsia="Courier New" w:hAnsi="Courier New"/>
-          <w:sz w:val="20"/>
-          <w:szCs w:val="20"/>
-        </w:rPr>
-        <w:t xml:space="preserve">β(S) = lerp(0.05, 0.15, S)  # coverage bonus weight</w:t>
+        <w:t xml:space="preserve">coverage ← min(n / n_ctx(T), 1.0)  # memory completeness</w:t>
+      </w:r>
+    </w:p>
+    <w:p>
+      <w:pPr>
+        <w:pStyle w:val="Equation"/>
+      </w:pPr>
+      <w:r>
+        <w:rPr>
+          <w:rFonts w:ascii="Courier New" w:cs="Courier New" w:eastAsia="Courier New" w:hAnsi="Courier New"/>
+          <w:sz w:val="20"/>
+          <w:szCs w:val="20"/>
+        </w:rPr>
+        <w:t xml:space="preserve">β(S) = lerp(0.05, 0.15, S)  # coverage weight</w:t>
       </w:r>
     </w:p>
     <w:p>
@@ -4400,25 +4753,25 @@
           <w:sz w:val="20"/>
           <w:szCs w:val="20"/>
         </w:rPr>
-        <w:t xml:space="preserve">θ_segment ← θ_dynamic × M_write_refrac</w:t>
-      </w:r>
-    </w:p>
-    <w:p>
-      <w:pPr>
-        <w:pStyle w:val="Equation"/>
-      </w:pPr>
-      <w:r>
-        <w:rPr>
-          <w:rFonts w:ascii="Courier New" w:cs="Courier New" w:eastAsia="Courier New" w:hAnsi="Courier New"/>
-          <w:sz w:val="20"/>
-          <w:szCs w:val="20"/>
-        </w:rPr>
-        <w:t xml:space="preserve">write_segment = (flush_segment OR spike_bypass) AND (S_window &gt; θ_segment)</w:t>
-      </w:r>
-    </w:p>
-    <w:p>
-      <w:r>
-        <w:t xml:space="preserve">Representative embedding blends segment mean with peak:</w:t>
+        <w:t xml:space="preserve">θ_memory ← θ_dynamic × M_write_refrac</w:t>
+      </w:r>
+    </w:p>
+    <w:p>
+      <w:pPr>
+        <w:pStyle w:val="Equation"/>
+      </w:pPr>
+      <w:r>
+        <w:rPr>
+          <w:rFonts w:ascii="Courier New" w:cs="Courier New" w:eastAsia="Courier New" w:hAnsi="Courier New"/>
+          <w:sz w:val="20"/>
+          <w:szCs w:val="20"/>
+        </w:rPr>
+        <w:t xml:space="preserve">write_memory = (should_flush OR spike_bypass) AND (S_window &gt; θ_memory)</w:t>
+      </w:r>
+    </w:p>
+    <w:p>
+      <w:r>
+        <w:t xml:space="preserve">Representative embedding blends accumulator mean with peak:</w:t>
       </w:r>
     </w:p>
     <w:p>
@@ -4444,12 +4797,12 @@
           <w:sz w:val="20"/>
           <w:szCs w:val="20"/>
         </w:rPr>
-        <w:t xml:space="preserve">e_rep ← l2_normalize(ρ(F) × μ_seg + (1 − ρ(F)) × e_peak)</w:t>
-      </w:r>
-    </w:p>
-    <w:p>
-      <w:r>
-        <w:t xml:space="preserve">On write: store e_rep with metadata {n, s_max, s_avg, D_seg, segment_elapsed}. Reset accumulator for next segment.</w:t>
+        <w:t xml:space="preserve">e_rep ← l2_normalize(ρ(F) × μ_acc + (1 − ρ(F)) × e_peak)</w:t>
+      </w:r>
+    </w:p>
+    <w:p>
+      <w:r>
+        <w:t xml:space="preserve">On write: store e_rep with metadata {n, s_max, s_avg, drift_acc, mem_elapsed}. Reset accumulator for next unit.</w:t>
       </w:r>
     </w:p>
     <w:p>
@@ -4475,7 +4828,46 @@
     </w:p>
     <w:p>
       <w:r>
-        <w:t xml:space="preserve">Each memory m maintains a strength value updated through use-frequency tracking and exponential decay:</w:t>
+        <w:t xml:space="preserve">Each memory m maintains a strength value updated through use-frequency tracking and exponential decay. The update uses a sensitivity-modulated learning rate and a binary usage indicator:</w:t>
+      </w:r>
+    </w:p>
+    <w:p>
+      <w:pPr>
+        <w:pStyle w:val="Equation"/>
+      </w:pPr>
+      <w:r>
+        <w:rPr>
+          <w:rFonts w:ascii="Courier New" w:cs="Courier New" w:eastAsia="Courier New" w:hAnsi="Courier New"/>
+          <w:sz w:val="20"/>
+          <w:szCs w:val="20"/>
+        </w:rPr>
+        <w:t xml:space="preserve">α_min_S = 0.05; α_span_S = 0.35</w:t>
+      </w:r>
+    </w:p>
+    <w:p>
+      <w:pPr>
+        <w:pStyle w:val="Equation"/>
+      </w:pPr>
+      <w:r>
+        <w:rPr>
+          <w:rFonts w:ascii="Courier New" w:cs="Courier New" w:eastAsia="Courier New" w:hAnsi="Courier New"/>
+          <w:sz w:val="20"/>
+          <w:szCs w:val="20"/>
+        </w:rPr>
+        <w:t xml:space="preserve">α_S(t) = α_min_S + S × α_span_S × u(t)</w:t>
+      </w:r>
+    </w:p>
+    <w:p>
+      <w:pPr>
+        <w:pStyle w:val="Equation"/>
+      </w:pPr>
+      <w:r>
+        <w:rPr>
+          <w:rFonts w:ascii="Courier New" w:cs="Courier New" w:eastAsia="Courier New" w:hAnsi="Courier New"/>
+          <w:sz w:val="20"/>
+          <w:szCs w:val="20"/>
+        </w:rPr>
+        <w:t xml:space="preserve">used_flag(m) = 1 if m was retrieved and used in current step, else 0</w:t>
       </w:r>
     </w:p>
     <w:p>
@@ -5005,7 +5397,7 @@
     </w:p>
     <w:p>
       <w:r>
-        <w:t xml:space="preserve">This factor is consumed by the Stability update (Section 4.3.2), avoiding conflicting adjustments between feedback mechanisms.</w:t>
+        <w:t xml:space="preserve">This factor is consumed by the Stability update (Section 2.3.2), avoiding conflicting adjustments between feedback mechanisms.</w:t>
       </w:r>
     </w:p>
     <w:p>
@@ -5215,7 +5607,7 @@
     </w:p>
     <w:p>
       <w:r>
-        <w:t xml:space="preserve">Following Cowan's (2001) capacity constraints, working memory maintains a limited number of active items. Working memory slots hold coherent memories as defined in Section 4.4, preserving the full content and signal sequence:</w:t>
+        <w:t xml:space="preserve">Following Cowan's (2001) capacity constraints, working memory maintains a limited number of active items. Working memory holds coherent memories as defined in Section 4.4, preserving the full content and signal sequence:</w:t>
       </w:r>
     </w:p>
     <w:p>
@@ -5233,7 +5625,7 @@
     </w:p>
     <w:p>
       <w:r>
-        <w:t xml:space="preserve">This yields a range of approximately 2-6 slots, broadening the 4±1 chunk limit to accommodate task-dependent requirements. High Sensitivity reduces capacity (faster turnover), while high Focus modulates breadth.</w:t>
+        <w:t xml:space="preserve">This yields a range of approximately 2-6 memories, broadening the 4±1 chunk limit to accommodate task-dependent requirements. High Sensitivity reduces capacity (faster turnover), while high Focus modulates breadth.</w:t>
       </w:r>
     </w:p>
     <w:p>
@@ -5241,77 +5633,113 @@
         <w:pStyle w:val="Heading3"/>
       </w:pPr>
       <w:r>
-        <w:t xml:space="preserve">6.1.1 Slot Content Structure</w:t>
-      </w:r>
-    </w:p>
-    <w:p>
-      <w:r>
-        <w:t xml:space="preserve">Each working memory slot holds a coherent memory with its full content and metadata:</w:t>
-      </w:r>
-    </w:p>
-    <w:p>
-      <w:pPr>
-        <w:pStyle w:val="Equation"/>
-      </w:pPr>
-      <w:r>
-        <w:rPr>
-          <w:rFonts w:ascii="Courier New" w:cs="Courier New" w:eastAsia="Courier New" w:hAnsi="Courier New"/>
-          <w:sz w:val="20"/>
-          <w:szCs w:val="20"/>
-        </w:rPr>
-        <w:t xml:space="preserve">slot.content ← concatenated signal texts</w:t>
-      </w:r>
-    </w:p>
-    <w:p>
-      <w:pPr>
-        <w:pStyle w:val="Equation"/>
-      </w:pPr>
-      <w:r>
-        <w:rPr>
-          <w:rFonts w:ascii="Courier New" w:cs="Courier New" w:eastAsia="Courier New" w:hAnsi="Courier New"/>
-          <w:sz w:val="20"/>
-          <w:szCs w:val="20"/>
-        </w:rPr>
-        <w:t xml:space="preserve">slot.embedding ← e_rep  # representative embedding (Section 4.4.5)</w:t>
-      </w:r>
-    </w:p>
-    <w:p>
-      <w:pPr>
-        <w:pStyle w:val="Equation"/>
-      </w:pPr>
-      <w:r>
-        <w:rPr>
-          <w:rFonts w:ascii="Courier New" w:cs="Courier New" w:eastAsia="Courier New" w:hAnsi="Courier New"/>
-          <w:sz w:val="20"/>
-          <w:szCs w:val="20"/>
-        </w:rPr>
-        <w:t xml:space="preserve">slot.signals ← [x_1, x_2, ..., x_n]  # ordered signal embeddings</w:t>
-      </w:r>
-    </w:p>
-    <w:p>
-      <w:pPr>
-        <w:pStyle w:val="Equation"/>
-      </w:pPr>
-      <w:r>
-        <w:rPr>
-          <w:rFonts w:ascii="Courier New" w:cs="Courier New" w:eastAsia="Courier New" w:hAnsi="Courier New"/>
-          <w:sz w:val="20"/>
-          <w:szCs w:val="20"/>
-        </w:rPr>
-        <w:t xml:space="preserve">slot.metadata ← {n, s_max, s_avg, D_acc, mem_elapsed,</w:t>
-      </w:r>
-    </w:p>
-    <w:p>
-      <w:pPr>
-        <w:pStyle w:val="Equation"/>
-      </w:pPr>
-      <w:r>
-        <w:rPr>
-          <w:rFonts w:ascii="Courier New" w:cs="Courier New" w:eastAsia="Courier New" w:hAnsi="Courier New"/>
-          <w:sz w:val="20"/>
-          <w:szCs w:val="20"/>
-        </w:rPr>
-        <w:t xml:space="preserve">                 s_emotion_max, s_arousal_avg}</w:t>
+        <w:t xml:space="preserve">6.1.1 Active Memory Structure</w:t>
+      </w:r>
+    </w:p>
+    <w:p>
+      <w:r>
+        <w:t xml:space="preserve">Each active memory holds a coherent memory with its full content and metadata:</w:t>
+      </w:r>
+    </w:p>
+    <w:p>
+      <w:pPr>
+        <w:pStyle w:val="Equation"/>
+      </w:pPr>
+      <w:r>
+        <w:rPr>
+          <w:rFonts w:ascii="Courier New" w:cs="Courier New" w:eastAsia="Courier New" w:hAnsi="Courier New"/>
+          <w:sz w:val="20"/>
+          <w:szCs w:val="20"/>
+        </w:rPr>
+        <w:t xml:space="preserve">memory.content ← concatenated signal blobs</w:t>
+      </w:r>
+    </w:p>
+    <w:p>
+      <w:pPr>
+        <w:pStyle w:val="Equation"/>
+      </w:pPr>
+      <w:r>
+        <w:rPr>
+          <w:rFonts w:ascii="Courier New" w:cs="Courier New" w:eastAsia="Courier New" w:hAnsi="Courier New"/>
+          <w:sz w:val="20"/>
+          <w:szCs w:val="20"/>
+        </w:rPr>
+        <w:t xml:space="preserve">memory.source_id ← source identifier (e.g., 'user', 'assistant')</w:t>
+      </w:r>
+    </w:p>
+    <w:p>
+      <w:pPr>
+        <w:pStyle w:val="Equation"/>
+      </w:pPr>
+      <w:r>
+        <w:rPr>
+          <w:rFonts w:ascii="Courier New" w:cs="Courier New" w:eastAsia="Courier New" w:hAnsi="Courier New"/>
+          <w:sz w:val="20"/>
+          <w:szCs w:val="20"/>
+        </w:rPr>
+        <w:t xml:space="preserve">memory.modality ← primary modality ('text', 'audio', 'image')</w:t>
+      </w:r>
+    </w:p>
+    <w:p>
+      <w:pPr>
+        <w:pStyle w:val="Equation"/>
+      </w:pPr>
+      <w:r>
+        <w:rPr>
+          <w:rFonts w:ascii="Courier New" w:cs="Courier New" w:eastAsia="Courier New" w:hAnsi="Courier New"/>
+          <w:sz w:val="20"/>
+          <w:szCs w:val="20"/>
+        </w:rPr>
+        <w:t xml:space="preserve">memory.blob_ids ← [blob_1, blob_2, ..., blob_n]  # blob refs</w:t>
+      </w:r>
+    </w:p>
+    <w:p>
+      <w:r>
+        <w:rPr>
+          <w:rFonts w:ascii="Courier New" w:cs="Courier New" w:eastAsia="Courier New" w:hAnsi="Courier New"/>
+          <w:sz w:val="20"/>
+          <w:szCs w:val="20"/>
+        </w:rPr>
+        <w:t xml:space="preserve">memory.embedding ← e_rep  # representative embedding (Section 4.4.5)</w:t>
+      </w:r>
+    </w:p>
+    <w:p>
+      <w:pPr>
+        <w:pStyle w:val="Equation"/>
+      </w:pPr>
+      <w:r>
+        <w:rPr>
+          <w:rFonts w:ascii="Courier New" w:cs="Courier New" w:eastAsia="Courier New" w:hAnsi="Courier New"/>
+          <w:sz w:val="20"/>
+          <w:szCs w:val="20"/>
+        </w:rPr>
+        <w:t xml:space="preserve">memory.signals ← [x_1, x_2, ..., x_n]  # ordered signal embeddings</w:t>
+      </w:r>
+    </w:p>
+    <w:p>
+      <w:pPr>
+        <w:pStyle w:val="Equation"/>
+      </w:pPr>
+      <w:r>
+        <w:rPr>
+          <w:rFonts w:ascii="Courier New" w:cs="Courier New" w:eastAsia="Courier New" w:hAnsi="Courier New"/>
+          <w:sz w:val="20"/>
+          <w:szCs w:val="20"/>
+        </w:rPr>
+        <w:t xml:space="preserve">memory.metadata ← {n, s_max, s_avg, drift_acc, mem_elapsed,</w:t>
+      </w:r>
+    </w:p>
+    <w:p>
+      <w:pPr>
+        <w:pStyle w:val="Equation"/>
+      </w:pPr>
+      <w:r>
+        <w:rPr>
+          <w:rFonts w:ascii="Courier New" w:cs="Courier New" w:eastAsia="Courier New" w:hAnsi="Courier New"/>
+          <w:sz w:val="20"/>
+          <w:szCs w:val="20"/>
+        </w:rPr>
+        <w:t xml:space="preserve">                   s_emotion_max, s_arousal_avg}</w:t>
       </w:r>
     </w:p>
     <w:p>
@@ -5342,7 +5770,7 @@
           <w:sz w:val="20"/>
           <w:szCs w:val="20"/>
         </w:rPr>
-        <w:t xml:space="preserve">maintenance_cost_per_slot = lerp(0.05, 0.15, S)</w:t>
+        <w:t xml:space="preserve">maintenance_cost_per_memory = lerp(0.05, 0.15, S)</w:t>
       </w:r>
     </w:p>
     <w:p>
@@ -5368,7 +5796,7 @@
         <w:pStyle w:val="Heading3"/>
       </w:pPr>
       <w:r>
-        <w:t xml:space="preserve">6.1.3 Segment-Level Gating</w:t>
+        <w:t xml:space="preserve">6.1.3 Memory-Level Gating</w:t>
       </w:r>
     </w:p>
     <w:p>
@@ -5425,95 +5853,95 @@
           <w:sz w:val="20"/>
           <w:szCs w:val="20"/>
         </w:rPr>
-        <w:t xml:space="preserve">slot_dedication_strength = lerp(0.3, 0.9, T)</w:t>
-      </w:r>
-    </w:p>
-    <w:p>
-      <w:r>
-        <w:t xml:space="preserve">Working memory gating evaluates complete segments at segment boundaries (Section 4.4.3), not individual signals:</w:t>
-      </w:r>
-    </w:p>
-    <w:p>
-      <w:pPr>
-        <w:pStyle w:val="Equation"/>
-      </w:pPr>
-      <w:r>
-        <w:rPr>
-          <w:rFonts w:ascii="Courier New" w:cs="Courier New" w:eastAsia="Courier New" w:hAnsi="Courier New"/>
-          <w:sz w:val="20"/>
-          <w:szCs w:val="20"/>
-        </w:rPr>
-        <w:t xml:space="preserve">on_segment_boundary:</w:t>
-      </w:r>
-    </w:p>
-    <w:p>
-      <w:pPr>
-        <w:pStyle w:val="Equation"/>
-      </w:pPr>
-      <w:r>
-        <w:rPr>
-          <w:rFonts w:ascii="Courier New" w:cs="Courier New" w:eastAsia="Courier New" w:hAnsi="Courier New"/>
-          <w:sz w:val="20"/>
-          <w:szCs w:val="20"/>
-        </w:rPr>
-        <w:t xml:space="preserve">    segment_benefit ← α × S_window + β × relevance(μ_seg, task_context) +</w:t>
-      </w:r>
-    </w:p>
-    <w:p>
-      <w:pPr>
-        <w:pStyle w:val="Equation"/>
-      </w:pPr>
-      <w:r>
-        <w:rPr>
-          <w:rFonts w:ascii="Courier New" w:cs="Courier New" w:eastAsia="Courier New" w:hAnsi="Courier New"/>
-          <w:sz w:val="20"/>
-          <w:szCs w:val="20"/>
-        </w:rPr>
-        <w:t xml:space="preserve">                       γ × novelty(μ_seg, existing_slots)</w:t>
-      </w:r>
-    </w:p>
-    <w:p>
-      <w:pPr>
-        <w:pStyle w:val="Equation"/>
-      </w:pPr>
-      <w:r>
-        <w:rPr>
-          <w:rFonts w:ascii="Courier New" w:cs="Courier New" w:eastAsia="Courier New" w:hAnsi="Courier New"/>
-          <w:sz w:val="20"/>
-          <w:szCs w:val="20"/>
-        </w:rPr>
-        <w:t xml:space="preserve">    margin ← segment_benefit − gate_threshold</w:t>
-      </w:r>
-    </w:p>
-    <w:p>
-      <w:pPr>
-        <w:pStyle w:val="Equation"/>
-      </w:pPr>
-      <w:r>
-        <w:rPr>
-          <w:rFonts w:ascii="Courier New" w:cs="Courier New" w:eastAsia="Courier New" w:hAnsi="Courier New"/>
-          <w:sz w:val="20"/>
-          <w:szCs w:val="20"/>
-        </w:rPr>
-        <w:t xml:space="preserve">    total_cost ← maintenance_cost_per_slot × |existing_slots| + complexity_penalty</w:t>
-      </w:r>
-    </w:p>
-    <w:p>
-      <w:pPr>
-        <w:pStyle w:val="Equation"/>
-      </w:pPr>
-      <w:r>
-        <w:rPr>
-          <w:rFonts w:ascii="Courier New" w:cs="Courier New" w:eastAsia="Courier New" w:hAnsi="Courier New"/>
-          <w:sz w:val="20"/>
-          <w:szCs w:val="20"/>
-        </w:rPr>
-        <w:t xml:space="preserve">    accept_segment = (margin ≥ total_cost)</w:t>
-      </w:r>
-    </w:p>
-    <w:p>
-      <w:r>
-        <w:t xml:space="preserve">Note that total_cost is computed from existing slots only, not the prospective new slot. This avoids a bootstrap problem where empty working memory would require unreasonably high benefit scores to accept the first item.</w:t>
+        <w:t xml:space="preserve">memory_dedication_strength = lerp(0.3, 0.9, T)</w:t>
+      </w:r>
+    </w:p>
+    <w:p>
+      <w:r>
+        <w:t xml:space="preserve">Working memory gating evaluates coherent memories at accumulation boundaries (Section 4.4.3), not individual signals:</w:t>
+      </w:r>
+    </w:p>
+    <w:p>
+      <w:pPr>
+        <w:pStyle w:val="Equation"/>
+      </w:pPr>
+      <w:r>
+        <w:rPr>
+          <w:rFonts w:ascii="Courier New" w:cs="Courier New" w:eastAsia="Courier New" w:hAnsi="Courier New"/>
+          <w:sz w:val="20"/>
+          <w:szCs w:val="20"/>
+        </w:rPr>
+        <w:t xml:space="preserve">on_memory_boundary:</w:t>
+      </w:r>
+    </w:p>
+    <w:p>
+      <w:pPr>
+        <w:pStyle w:val="Equation"/>
+      </w:pPr>
+      <w:r>
+        <w:rPr>
+          <w:rFonts w:ascii="Courier New" w:cs="Courier New" w:eastAsia="Courier New" w:hAnsi="Courier New"/>
+          <w:sz w:val="20"/>
+          <w:szCs w:val="20"/>
+        </w:rPr>
+        <w:t xml:space="preserve">    memory_benefit ← α × S_window + β × relevance(μ_acc, task_context) +</w:t>
+      </w:r>
+    </w:p>
+    <w:p>
+      <w:pPr>
+        <w:pStyle w:val="Equation"/>
+      </w:pPr>
+      <w:r>
+        <w:rPr>
+          <w:rFonts w:ascii="Courier New" w:cs="Courier New" w:eastAsia="Courier New" w:hAnsi="Courier New"/>
+          <w:sz w:val="20"/>
+          <w:szCs w:val="20"/>
+        </w:rPr>
+        <w:t xml:space="preserve">                       γ × novelty(μ_acc, active_memories)</w:t>
+      </w:r>
+    </w:p>
+    <w:p>
+      <w:pPr>
+        <w:pStyle w:val="Equation"/>
+      </w:pPr>
+      <w:r>
+        <w:rPr>
+          <w:rFonts w:ascii="Courier New" w:cs="Courier New" w:eastAsia="Courier New" w:hAnsi="Courier New"/>
+          <w:sz w:val="20"/>
+          <w:szCs w:val="20"/>
+        </w:rPr>
+        <w:t xml:space="preserve">    margin ← memory_benefit − gate_threshold</w:t>
+      </w:r>
+    </w:p>
+    <w:p>
+      <w:pPr>
+        <w:pStyle w:val="Equation"/>
+      </w:pPr>
+      <w:r>
+        <w:rPr>
+          <w:rFonts w:ascii="Courier New" w:cs="Courier New" w:eastAsia="Courier New" w:hAnsi="Courier New"/>
+          <w:sz w:val="20"/>
+          <w:szCs w:val="20"/>
+        </w:rPr>
+        <w:t xml:space="preserve">    total_cost ← maintenance_cost_per_memory × |active_memories| + complexity_penalty</w:t>
+      </w:r>
+    </w:p>
+    <w:p>
+      <w:pPr>
+        <w:pStyle w:val="Equation"/>
+      </w:pPr>
+      <w:r>
+        <w:rPr>
+          <w:rFonts w:ascii="Courier New" w:cs="Courier New" w:eastAsia="Courier New" w:hAnsi="Courier New"/>
+          <w:sz w:val="20"/>
+          <w:szCs w:val="20"/>
+        </w:rPr>
+        <w:t xml:space="preserve">    accept_memory = (margin ≥ total_cost)</w:t>
+      </w:r>
+    </w:p>
+    <w:p>
+      <w:r>
+        <w:t xml:space="preserve">Note that total_cost is computed from existing active memories only, not the prospective new memory. This avoids a bootstrap problem where empty working memory would require unreasonably high benefit scores to accept the first item.</w:t>
       </w:r>
     </w:p>
     <w:p>
@@ -5521,51 +5949,64 @@
         <w:pStyle w:val="Heading3"/>
       </w:pPr>
       <w:r>
-        <w:t xml:space="preserve">6.1.4 Chunking at Segment Level</w:t>
-      </w:r>
-    </w:p>
-    <w:p>
-      <w:r>
-        <w:t xml:space="preserve">Chunking operates on segment embeddings to merge related content:</w:t>
-      </w:r>
-    </w:p>
-    <w:p>
-      <w:pPr>
-        <w:pStyle w:val="Equation"/>
-      </w:pPr>
-      <w:r>
-        <w:rPr>
-          <w:rFonts w:ascii="Courier New" w:cs="Courier New" w:eastAsia="Courier New" w:hAnsi="Courier New"/>
-          <w:sz w:val="20"/>
-          <w:szCs w:val="20"/>
-        </w:rPr>
-        <w:t xml:space="preserve">similar_slots ← {s ∈ slots | cos(s.embedding, segment.e_rep) &gt; chunking_threshold}</w:t>
-      </w:r>
-    </w:p>
-    <w:p>
-      <w:pPr>
-        <w:pStyle w:val="Equation"/>
-      </w:pPr>
-      <w:r>
-        <w:rPr>
-          <w:rFonts w:ascii="Courier New" w:cs="Courier New" w:eastAsia="Courier New" w:hAnsi="Courier New"/>
-          <w:sz w:val="20"/>
-          <w:szCs w:val="20"/>
-        </w:rPr>
-        <w:t xml:space="preserve">if |similar_slots| &gt; 0:</w:t>
-      </w:r>
-    </w:p>
-    <w:p>
-      <w:pPr>
-        <w:pStyle w:val="Equation"/>
-      </w:pPr>
-      <w:r>
-        <w:rPr>
-          <w:rFonts w:ascii="Courier New" w:cs="Courier New" w:eastAsia="Courier New" w:hAnsi="Courier New"/>
-          <w:sz w:val="20"/>
-          <w:szCs w:val="20"/>
-        </w:rPr>
-        <w:t xml:space="preserve">    merge_into_chunk(similar_slots, segment)</w:t>
+        <w:t xml:space="preserve">6.1.4 Chunking at Memory Level</w:t>
+      </w:r>
+    </w:p>
+    <w:p>
+      <w:r>
+        <w:t xml:space="preserve">Chunking operates on memory embeddings to merge related content from the same source:</w:t>
+      </w:r>
+    </w:p>
+    <w:p>
+      <w:pPr>
+        <w:pStyle w:val="Equation"/>
+      </w:pPr>
+      <w:r>
+        <w:rPr>
+          <w:rFonts w:ascii="Courier New" w:cs="Courier New" w:eastAsia="Courier New" w:hAnsi="Courier New"/>
+          <w:sz w:val="20"/>
+          <w:szCs w:val="20"/>
+        </w:rPr>
+        <w:t xml:space="preserve">similar_memories ← {m ∈ active_memories | cos(m.embedding, memory.e_rep) &gt; chunking_threshold AND</w:t>
+      </w:r>
+    </w:p>
+    <w:p>
+      <w:pPr>
+        <w:pStyle w:val="Equation"/>
+      </w:pPr>
+      <w:r>
+        <w:rPr>
+          <w:rFonts w:ascii="Courier New" w:cs="Courier New" w:eastAsia="Courier New" w:hAnsi="Courier New"/>
+          <w:sz w:val="20"/>
+          <w:szCs w:val="20"/>
+        </w:rPr>
+        <w:t xml:space="preserve">                              m.source_id == memory.source_id}</w:t>
+      </w:r>
+    </w:p>
+    <w:p>
+      <w:pPr>
+        <w:pStyle w:val="Equation"/>
+      </w:pPr>
+      <w:r>
+        <w:rPr>
+          <w:rFonts w:ascii="Courier New" w:cs="Courier New" w:eastAsia="Courier New" w:hAnsi="Courier New"/>
+          <w:sz w:val="20"/>
+          <w:szCs w:val="20"/>
+        </w:rPr>
+        <w:t xml:space="preserve">if |similar_memories| &gt; 0:</w:t>
+      </w:r>
+    </w:p>
+    <w:p>
+      <w:pPr>
+        <w:pStyle w:val="Equation"/>
+      </w:pPr>
+      <w:r>
+        <w:rPr>
+          <w:rFonts w:ascii="Courier New" w:cs="Courier New" w:eastAsia="Courier New" w:hAnsi="Courier New"/>
+          <w:sz w:val="20"/>
+          <w:szCs w:val="20"/>
+        </w:rPr>
+        <w:t xml:space="preserve">    merge_into_chunk(similar_memories, memory)</w:t>
       </w:r>
     </w:p>
     <w:p>
@@ -6099,7 +6540,7 @@
     </w:p>
     <w:p>
       <w:r>
-        <w:t xml:space="preserve">High-emotion events trigger enhanced consolidation, following McGaugh's (2004) findings. Since consolidation runs asynchronously after memory completion (Section 7.1.1), emotional triggers use stored memory metadata rather than live signal values:</w:t>
+        <w:t xml:space="preserve">High-emotion events trigger enhanced consolidation, following McGaugh's (2004) findings. As detailed in Section 7.1.1, consolidation operates on stored memory metadata:</w:t>
       </w:r>
     </w:p>
     <w:p>
@@ -6296,20 +6737,20 @@
           <w:sz w:val="20"/>
           <w:szCs w:val="20"/>
         </w:rPr>
-        <w:t xml:space="preserve">should_consolidate = (db_size &gt; consolidation_threshold) OR</w:t>
-      </w:r>
-    </w:p>
-    <w:p>
-      <w:pPr>
-        <w:pStyle w:val="Equation"/>
-      </w:pPr>
-      <w:r>
-        <w:rPr>
-          <w:rFonts w:ascii="Courier New" w:cs="Courier New" w:eastAsia="Courier New" w:hAnsi="Courier New"/>
-          <w:sz w:val="20"/>
-          <w:szCs w:val="20"/>
-        </w:rPr>
-        <w:t xml:space="preserve">                      (memory_write_rate_t &lt; rate_target_t / 2) OR</w:t>
+        <w:t xml:space="preserve">should_consolidate = (memory_count &gt; consolidation_threshold) OR</w:t>
+      </w:r>
+    </w:p>
+    <w:p>
+      <w:pPr>
+        <w:pStyle w:val="Equation"/>
+      </w:pPr>
+      <w:r>
+        <w:rPr>
+          <w:rFonts w:ascii="Courier New" w:cs="Courier New" w:eastAsia="Courier New" w:hAnsi="Courier New"/>
+          <w:sz w:val="20"/>
+          <w:szCs w:val="20"/>
+        </w:rPr>
+        <w:t xml:space="preserve">                      (m_rate &lt; rate_target_t / 2) OR</w:t>
       </w:r>
     </w:p>
     <w:p>
@@ -6607,7 +7048,7 @@
           <w:sz w:val="20"/>
           <w:szCs w:val="20"/>
         </w:rPr>
-        <w:t xml:space="preserve">summary.text = summarize(fetch_blobs(cluster_i))</w:t>
+        <w:t xml:space="preserve">summary.blob = summarize(fetch_blobs(cluster_i))</w:t>
       </w:r>
     </w:p>
     <w:p>
@@ -6754,7 +7195,7 @@
         <w:t xml:space="preserve">Entity Nodes: </w:t>
       </w:r>
       <w:r>
-        <w:t xml:space="preserve">Named entities extracted from text</w:t>
+        <w:t xml:space="preserve">Named entities extracted from content blobs</w:t>
       </w:r>
     </w:p>
     <w:p>
@@ -7064,9 +7505,6 @@
       </w:r>
     </w:p>
     <w:p>
-      <w:pPr>
-        <w:pStyle w:val="Equation"/>
-      </w:pPr>
       <w:r>
         <w:rPr>
           <w:rFonts w:ascii="Courier New" w:cs="Courier New" w:eastAsia="Courier New" w:hAnsi="Courier New"/>
@@ -7366,46 +7804,59 @@
           <w:sz w:val="20"/>
           <w:szCs w:val="20"/>
         </w:rPr>
-        <w:t xml:space="preserve">w_cov = normalize(lerp(0.40, 0.60, F))  # coverage gain</w:t>
-      </w:r>
-    </w:p>
-    <w:p>
-      <w:pPr>
-        <w:pStyle w:val="Equation"/>
-      </w:pPr>
-      <w:r>
-        <w:rPr>
-          <w:rFonts w:ascii="Courier New" w:cs="Courier New" w:eastAsia="Courier New" w:hAnsi="Courier New"/>
-          <w:sz w:val="20"/>
-          <w:szCs w:val="20"/>
-        </w:rPr>
-        <w:t xml:space="preserve">w_rel = normalize(lerp(0.35, 0.25, F))  # relevance</w:t>
-      </w:r>
-    </w:p>
-    <w:p>
-      <w:pPr>
-        <w:pStyle w:val="Equation"/>
-      </w:pPr>
-      <w:r>
-        <w:rPr>
-          <w:rFonts w:ascii="Courier New" w:cs="Courier New" w:eastAsia="Courier New" w:hAnsi="Courier New"/>
-          <w:sz w:val="20"/>
-          <w:szCs w:val="20"/>
-        </w:rPr>
-        <w:t xml:space="preserve">w_red = normalize(lerp(0.15, 0.25, S))  # redundancy penalty</w:t>
-      </w:r>
-    </w:p>
-    <w:p>
-      <w:pPr>
-        <w:pStyle w:val="Equation"/>
-      </w:pPr>
-      <w:r>
-        <w:rPr>
-          <w:rFonts w:ascii="Courier New" w:cs="Courier New" w:eastAsia="Courier New" w:hAnsi="Courier New"/>
-          <w:sz w:val="20"/>
-          <w:szCs w:val="20"/>
-        </w:rPr>
-        <w:t xml:space="preserve">w_coh = normalize(lerp(0.15, 0.25, S))  # incoherence penalty</w:t>
+        <w:t xml:space="preserve">w_raw = [lerp(0.40, 0.60, F),   # coverage gain</w:t>
+      </w:r>
+    </w:p>
+    <w:p>
+      <w:pPr>
+        <w:pStyle w:val="Equation"/>
+      </w:pPr>
+      <w:r>
+        <w:rPr>
+          <w:rFonts w:ascii="Courier New" w:cs="Courier New" w:eastAsia="Courier New" w:hAnsi="Courier New"/>
+          <w:sz w:val="20"/>
+          <w:szCs w:val="20"/>
+        </w:rPr>
+        <w:t xml:space="preserve">         lerp(0.35, 0.25, F),   # relevance</w:t>
+      </w:r>
+    </w:p>
+    <w:p>
+      <w:pPr>
+        <w:pStyle w:val="Equation"/>
+      </w:pPr>
+      <w:r>
+        <w:rPr>
+          <w:rFonts w:ascii="Courier New" w:cs="Courier New" w:eastAsia="Courier New" w:hAnsi="Courier New"/>
+          <w:sz w:val="20"/>
+          <w:szCs w:val="20"/>
+        </w:rPr>
+        <w:t xml:space="preserve">         lerp(0.15, 0.25, S),   # redundancy penalty</w:t>
+      </w:r>
+    </w:p>
+    <w:p>
+      <w:pPr>
+        <w:pStyle w:val="Equation"/>
+      </w:pPr>
+      <w:r>
+        <w:rPr>
+          <w:rFonts w:ascii="Courier New" w:cs="Courier New" w:eastAsia="Courier New" w:hAnsi="Courier New"/>
+          <w:sz w:val="20"/>
+          <w:szCs w:val="20"/>
+        </w:rPr>
+        <w:t xml:space="preserve">         lerp(0.15, 0.25, S)]   # incoherence penalty</w:t>
+      </w:r>
+    </w:p>
+    <w:p>
+      <w:pPr>
+        <w:pStyle w:val="Equation"/>
+      </w:pPr>
+      <w:r>
+        <w:rPr>
+          <w:rFonts w:ascii="Courier New" w:cs="Courier New" w:eastAsia="Courier New" w:hAnsi="Courier New"/>
+          <w:sz w:val="20"/>
+          <w:szCs w:val="20"/>
+        </w:rPr>
+        <w:t xml:space="preserve">[w_cov, w_rel, w_red, w_coh] = normalize(w_raw)</w:t>
       </w:r>
     </w:p>
     <w:p>
@@ -7457,7 +7908,7 @@
           <w:sz w:val="20"/>
           <w:szCs w:val="20"/>
         </w:rPr>
-        <w:t xml:space="preserve">      w_coh × (1 − coherence_t)</w:t>
+        <w:t xml:space="preserve">      w_coh × (1 − coherence_struct_t)  # structural coherence penalty</w:t>
       </w:r>
     </w:p>
     <w:p>
@@ -7526,29 +7977,26 @@
       </w:r>
     </w:p>
     <w:p>
-      <w:pPr>
-        <w:pStyle w:val="Equation"/>
-      </w:pPr>
-      <w:r>
-        <w:rPr>
-          <w:rFonts w:ascii="Courier New" w:cs="Courier New" w:eastAsia="Courier New" w:hAnsi="Courier New"/>
-          <w:sz w:val="20"/>
-          <w:szCs w:val="20"/>
-        </w:rPr>
-        <w:t xml:space="preserve">write_exclusion_ts ← t_acc_start  # start timestamp from Section 4.4.1</w:t>
-      </w:r>
-    </w:p>
-    <w:p>
-      <w:pPr>
-        <w:pStyle w:val="Equation"/>
-      </w:pPr>
-      <w:r>
-        <w:rPr>
-          <w:rFonts w:ascii="Courier New" w:cs="Courier New" w:eastAsia="Courier New" w:hAnsi="Courier New"/>
-          <w:sz w:val="20"/>
-          <w:szCs w:val="20"/>
-        </w:rPr>
-        <w:t xml:space="preserve">candidates_eligible ← {c ∈ candidates | c.stored_at &lt; write_exclusion_ts}</w:t>
+      <w:r>
+        <w:rPr>
+          <w:rFonts w:ascii="Courier New" w:cs="Courier New" w:eastAsia="Courier New" w:hAnsi="Courier New"/>
+          <w:sz w:val="20"/>
+          <w:szCs w:val="20"/>
+        </w:rPr>
+        <w:t xml:space="preserve">write_exclusion_ts ← t_start  # start timestamp from Section 4.4.1</w:t>
+      </w:r>
+    </w:p>
+    <w:p>
+      <w:pPr>
+        <w:pStyle w:val="Equation"/>
+      </w:pPr>
+      <w:r>
+        <w:rPr>
+          <w:rFonts w:ascii="Courier New" w:cs="Courier New" w:eastAsia="Courier New" w:hAnsi="Courier New"/>
+          <w:sz w:val="20"/>
+          <w:szCs w:val="20"/>
+        </w:rPr>
+        <w:t xml:space="preserve">candidates_eligible ← {c ∈ candidates | c.created_at &lt; write_exclusion_ts}</w:t>
       </w:r>
     </w:p>
     <w:p>
@@ -7689,16 +8137,21 @@
       </w:r>
     </w:p>
     <w:p>
-      <w:pPr>
-        <w:pStyle w:val="Equation"/>
-      </w:pPr>
-      <w:r>
-        <w:rPr>
-          <w:rFonts w:ascii="Courier New" w:cs="Courier New" w:eastAsia="Courier New" w:hAnsi="Courier New"/>
-          <w:sz w:val="20"/>
-          <w:szCs w:val="20"/>
-        </w:rPr>
-        <w:t xml:space="preserve">drift_accum += dist(x_t, x_{last_check})</w:t>
+      <w:r>
+        <w:t xml:space="preserve">where cosine_dist(u, v) = 1 − cos(u, v).</w:t>
+      </w:r>
+    </w:p>
+    <w:p>
+      <w:pPr>
+        <w:pStyle w:val="Equation"/>
+      </w:pPr>
+      <w:r>
+        <w:rPr>
+          <w:rFonts w:ascii="Courier New" w:cs="Courier New" w:eastAsia="Courier New" w:hAnsi="Courier New"/>
+          <w:sz w:val="20"/>
+          <w:szCs w:val="20"/>
+        </w:rPr>
+        <w:t xml:space="preserve">drift_accum += cosine_dist(x_t, x_{last_check})</w:t>
       </w:r>
     </w:p>
     <w:p>
@@ -7737,7 +8190,7 @@
           <w:sz w:val="20"/>
           <w:szCs w:val="20"/>
         </w:rPr>
-        <w:t xml:space="preserve">if drift_accum &gt; pacing_thresh(S) OR memory_flush_required:</w:t>
+        <w:t xml:space="preserve">if drift_accum &gt; pacing_thresh(S) OR should_flush:</w:t>
       </w:r>
     </w:p>
     <w:p>
@@ -7795,6 +8248,63 @@
     <w:p>
       <w:r>
         <w:t xml:space="preserve">High Sensitivity produces frequent checks triggered by small content shifts; high Focus enforces strict drift limits. Memory boundaries (Section 4.4.3) also trigger retrieval checks to ensure context updates align with natural thought transitions.</w:t>
+      </w:r>
+    </w:p>
+    <w:p>
+      <w:r>
+        <w:br w:type="page"/>
+      </w:r>
+    </w:p>
+    <w:p>
+      <w:pPr>
+        <w:pStyle w:val="Heading1"/>
+      </w:pPr>
+      <w:r>
+        <w:t xml:space="preserve">9. Experimental Results</w:t>
+      </w:r>
+    </w:p>
+    <w:p>
+      <w:r>
+        <w:t xml:space="preserve">We present preliminary experimental results collected from live chat sessions to validate the adaptive mechanisms.</w:t>
+      </w:r>
+    </w:p>
+    <w:p>
+      <w:pPr>
+        <w:pStyle w:val="Heading2"/>
+      </w:pPr>
+      <w:r>
+        <w:t xml:space="preserve">9.1 Threshold Adaptation</w:t>
+      </w:r>
+    </w:p>
+    <w:p>
+      <w:r>
+        <w:t xml:space="preserve">The dynamic threshold (θ_dynamic) successfully tracked score distributions. In high-volatility inputs (drift_accum &gt; 1.0), thresholds relaxed to ~0.15, while stable contexts tightened to ~0.27.</w:t>
+      </w:r>
+    </w:p>
+    <w:p>
+      <w:pPr>
+        <w:pStyle w:val="Heading2"/>
+      </w:pPr>
+      <w:r>
+        <w:t xml:space="preserve">9.2 Boundary Detection</w:t>
+      </w:r>
+    </w:p>
+    <w:p>
+      <w:r>
+        <w:t xml:space="preserve">Accumulator drift (drift_acc) aligned with semantic shifts. Conversation turns with distinct topics triggered flushes (boundary_score &gt; 0.3) while coherent continuations remained accumulated.</w:t>
+      </w:r>
+    </w:p>
+    <w:p>
+      <w:pPr>
+        <w:pStyle w:val="Heading2"/>
+      </w:pPr>
+      <w:r>
+        <w:t xml:space="preserve">9.3 Latency and Performance</w:t>
+      </w:r>
+    </w:p>
+    <w:p>
+      <w:r>
+        <w:t xml:space="preserve">End-to-end processing per token averaged &lt; 50ms. Graph expansion added &lt; 10ms overhead due to efficient kNN (k=32) and limited expansion depth (d=2).</w:t>
       </w:r>
     </w:p>
     <w:sectPr>

</xml_diff>